<commit_message>
Add all author names with registration numbers to paper
Co-authored-by: Mujeeb-U-Rehman <197483016+Mujeeb-U-Rehman@users.noreply.github.com>
</commit_message>
<xml_diff>
--- a/Blockchain_Information_Assurance_Review.docx
+++ b/Blockchain_Information_Assurance_Review.docx
@@ -81,7 +81,97 @@
         <w:pStyle w:val="Author"/>
       </w:pPr>
       <w:r>
-        <w:t xml:space="preserve">Mujeeb-U-Rehman</w:t>
+        <w:t xml:space="preserve">Mujeeb</w:t>
+      </w:r>
+      <w:r>
+        <w:t xml:space="preserve"> </w:t>
+      </w:r>
+      <w:r>
+        <w:t xml:space="preserve">U</w:t>
+      </w:r>
+      <w:r>
+        <w:t xml:space="preserve"> </w:t>
+      </w:r>
+      <w:r>
+        <w:t xml:space="preserve">Rehman</w:t>
+      </w:r>
+      <w:r>
+        <w:t xml:space="preserve"> </w:t>
+      </w:r>
+      <w:r>
+        <w:t xml:space="preserve">(2023558)</w:t>
+      </w:r>
+    </w:p>
+    <w:p>
+      <w:pPr>
+        <w:pStyle w:val="Author"/>
+      </w:pPr>
+      <w:r>
+        <w:t xml:space="preserve">M.</w:t>
+      </w:r>
+      <w:r>
+        <w:t xml:space="preserve"> </w:t>
+      </w:r>
+      <w:r>
+        <w:t xml:space="preserve">Abdullah</w:t>
+      </w:r>
+      <w:r>
+        <w:t xml:space="preserve"> </w:t>
+      </w:r>
+      <w:r>
+        <w:t xml:space="preserve">Khan</w:t>
+      </w:r>
+      <w:r>
+        <w:t xml:space="preserve"> </w:t>
+      </w:r>
+      <w:r>
+        <w:t xml:space="preserve">(2023346)</w:t>
+      </w:r>
+    </w:p>
+    <w:p>
+      <w:pPr>
+        <w:pStyle w:val="Author"/>
+      </w:pPr>
+      <w:r>
+        <w:t xml:space="preserve">Muhammad</w:t>
+      </w:r>
+      <w:r>
+        <w:t xml:space="preserve"> </w:t>
+      </w:r>
+      <w:r>
+        <w:t xml:space="preserve">Bin</w:t>
+      </w:r>
+      <w:r>
+        <w:t xml:space="preserve"> </w:t>
+      </w:r>
+      <w:r>
+        <w:t xml:space="preserve">Waseem</w:t>
+      </w:r>
+      <w:r>
+        <w:t xml:space="preserve"> </w:t>
+      </w:r>
+      <w:r>
+        <w:t xml:space="preserve">(2023403)</w:t>
+      </w:r>
+    </w:p>
+    <w:p>
+      <w:pPr>
+        <w:pStyle w:val="Author"/>
+      </w:pPr>
+      <w:r>
+        <w:t xml:space="preserve">Faizan</w:t>
+      </w:r>
+      <w:r>
+        <w:t xml:space="preserve"> </w:t>
+      </w:r>
+      <w:r>
+        <w:t xml:space="preserve">Ali</w:t>
+      </w:r>
+      <w:r>
+        <w:t xml:space="preserve"> </w:t>
+      </w:r>
+      <w:r>
+        <w:t xml:space="preserve">(2023192)</w:t>
       </w:r>
     </w:p>
     <w:p>

</xml_diff>